<commit_message>
docs(compliance): fix docx math-mangling — disable pandoc tex_math_dollars
Plain gfm treats paired dollar amounts in prose as TeX math, so every
paragraph with two \$ figures (Sheriff, HRD, Elections, exec summary Q2,
and six more — 10 spans total) rendered as space-collapsed italics in the
docx. Regenerated with -f gfm-tex_math_dollars (0 math nodes, artifact
scan clean); the required command is now pinned in an HTML comment at the
top of the md so future regenerations can't reintroduce it.

Co-Authored-By: Claude Fable 5 <noreply@anthropic.com>
Claude-Session: https://claude.ai/code/session_018FUCkxdussGh5hGvVC9JwS
</commit_message>
<xml_diff>
--- a/reports/resolution-240210-compliance-report.docx
+++ b/reports/resolution-240210-compliance-report.docx
@@ -718,255 +718,17 @@
         </w:numPr>
       </w:pPr>
       <w:r>
-        <w:t xml:space="preserve">**Does any of the</w:t>
-      </w:r>
-      <w:r>
-        <w:t xml:space="preserve"> </w:t>
-      </w:r>
-      <m:oMath>
-        <m:r>
-          <m:t>36.5</m:t>
-        </m:r>
-        <m:r>
-          <m:t>m</m:t>
-        </m:r>
-        <m:r>
-          <m:t>i</m:t>
-        </m:r>
-        <m:r>
-          <m:t>l</m:t>
-        </m:r>
-        <m:r>
-          <m:t>l</m:t>
-        </m:r>
-        <m:r>
-          <m:t>i</m:t>
-        </m:r>
-        <m:r>
-          <m:t>o</m:t>
-        </m:r>
-        <m:r>
-          <m:t>n</m:t>
-        </m:r>
-        <m:r>
-          <m:t>i</m:t>
-        </m:r>
-        <m:r>
-          <m:t>n</m:t>
-        </m:r>
-        <m:r>
-          <m:t>a</m:t>
-        </m:r>
-        <m:r>
-          <m:t>g</m:t>
-        </m:r>
-        <m:r>
-          <m:t>e</m:t>
-        </m:r>
-        <m:r>
-          <m:t>n</m:t>
-        </m:r>
-        <m:r>
-          <m:t>c</m:t>
-        </m:r>
-        <m:r>
-          <m:t>y</m:t>
-        </m:r>
-        <m:r>
-          <m:t>c</m:t>
-        </m:r>
-        <m:r>
-          <m:t>o</m:t>
-        </m:r>
-        <m:r>
-          <m:t>n</m:t>
-        </m:r>
-        <m:r>
-          <m:t>t</m:t>
-        </m:r>
-        <m:r>
-          <m:t>r</m:t>
-        </m:r>
-        <m:r>
-          <m:t>a</m:t>
-        </m:r>
-        <m:r>
-          <m:t>c</m:t>
-        </m:r>
-        <m:r>
-          <m:t>t</m:t>
-        </m:r>
-        <m:r>
-          <m:t>s</m:t>
-        </m:r>
-        <m:r>
-          <m:t>r</m:t>
-        </m:r>
-        <m:r>
-          <m:t>e</m:t>
-        </m:r>
-        <m:r>
-          <m:t>a</m:t>
-        </m:r>
-        <m:r>
-          <m:t>c</m:t>
-        </m:r>
-        <m:r>
-          <m:t>h</m:t>
-        </m:r>
-        <m:r>
-          <m:t>e</m:t>
-        </m:r>
-        <m:r>
-          <m:t>t</m:t>
-        </m:r>
-        <m:r>
-          <m:t>h</m:t>
-        </m:r>
-        <m:r>
-          <m:t>n</m:t>
-        </m:r>
-        <m:r>
-          <m:t>i</m:t>
-        </m:r>
-        <m:r>
-          <m:t>c</m:t>
-        </m:r>
-        <m:r>
-          <m:t>m</m:t>
-        </m:r>
-        <m:r>
-          <m:t>e</m:t>
-        </m:r>
-        <m:r>
-          <m:t>d</m:t>
-        </m:r>
-        <m:r>
-          <m:t>i</m:t>
-        </m:r>
-        <m:r>
-          <m:t>a</m:t>
-        </m:r>
-        <m:r>
-          <m:rPr>
-            <m:sty m:val="p"/>
-          </m:rPr>
-          <m:t>?</m:t>
-        </m:r>
-        <m:r>
-          <m:rPr>
-            <m:sty m:val="p"/>
-          </m:rPr>
-          <m:t>*</m:t>
-        </m:r>
-        <m:r>
-          <m:rPr>
-            <m:sty m:val="p"/>
-          </m:rPr>
-          <m:t>*</m:t>
-        </m:r>
-        <m:r>
-          <m:t>A</m:t>
-        </m:r>
-        <m:r>
-          <m:t>g</m:t>
-        </m:r>
-        <m:r>
-          <m:t>e</m:t>
-        </m:r>
-        <m:r>
-          <m:t>n</m:t>
-        </m:r>
-        <m:r>
-          <m:t>c</m:t>
-        </m:r>
-        <m:r>
-          <m:t>i</m:t>
-        </m:r>
-        <m:r>
-          <m:t>e</m:t>
-        </m:r>
-        <m:r>
-          <m:t>s</m:t>
-        </m:r>
-        <m:r>
-          <m:t>l</m:t>
-        </m:r>
-        <m:r>
-          <m:t>i</m:t>
-        </m:r>
-        <m:r>
-          <m:t>k</m:t>
-        </m:r>
-        <m:r>
-          <m:t>e</m:t>
-        </m:r>
-        <m:r>
-          <m:t>C</m:t>
-        </m:r>
-        <m:r>
-          <m:t>i</m:t>
-        </m:r>
-        <m:r>
-          <m:t>v</m:t>
-        </m:r>
-        <m:r>
-          <m:t>i</m:t>
-        </m:r>
-        <m:r>
-          <m:t>c</m:t>
-        </m:r>
-        <m:r>
-          <m:t>E</m:t>
-        </m:r>
-        <m:r>
-          <m:t>d</m:t>
-        </m:r>
-        <m:r>
-          <m:t>g</m:t>
-        </m:r>
-        <m:r>
-          <m:t>e</m:t>
-        </m:r>
-        <m:r>
-          <m:t>C</m:t>
-        </m:r>
-        <m:r>
-          <m:t>o</m:t>
-        </m:r>
-        <m:r>
-          <m:t>n</m:t>
-        </m:r>
-        <m:r>
-          <m:t>s</m:t>
-        </m:r>
-        <m:r>
-          <m:t>u</m:t>
-        </m:r>
-        <m:r>
-          <m:t>l</m:t>
-        </m:r>
-        <m:r>
-          <m:t>t</m:t>
-        </m:r>
-        <m:r>
-          <m:t>i</m:t>
-        </m:r>
-        <m:r>
-          <m:t>n</m:t>
-        </m:r>
-        <m:r>
-          <m:t>g</m:t>
-        </m:r>
-        <m:r>
-          <m:rPr>
-            <m:sty m:val="p"/>
-          </m:rPr>
-          <m:t>(</m:t>
-        </m:r>
-      </m:oMath>
-      <w:r>
-        <w:t xml:space="preserve">23.8M through FY2026) and Most Likely To ($4.9M) receive city funds for marketing and communications work not classified as "Advertising" in the financial system. Some of this spending may well include ethnic media placements — but we cannot tell from the data. Departments and agencies are best positioned to answer this question.</w:t>
+        <w:rPr>
+          <w:b/>
+          <w:bCs/>
+        </w:rPr>
+        <w:t xml:space="preserve">Does any of the $36.5 million in agency contracts reach ethnic media?</w:t>
+      </w:r>
+      <w:r>
+        <w:t xml:space="preserve"> </w:t>
+      </w:r>
+      <w:r>
+        <w:t xml:space="preserve">Agencies like Civic Edge Consulting ($23.8M through FY2026) and Most Likely To ($4.9M) receive city funds for marketing and communications work not classified as "Advertising" in the financial system. Some of this spending may well include ethnic media placements — but we cannot tell from the data. Departments and agencies are best positioned to answer this question.</w:t>
       </w:r>
     </w:p>
     <w:p>
@@ -1941,221 +1703,7 @@
         <w:t xml:space="preserve"> </w:t>
       </w:r>
       <w:r>
-        <w:t xml:space="preserve">In the 2017–2022 period, the top four advertising recipients were Daily Journal Corporation (</w:t>
-      </w:r>
-      <m:oMath>
-        <m:r>
-          <m:t>1.73</m:t>
-        </m:r>
-        <m:r>
-          <m:t>M</m:t>
-        </m:r>
-        <m:r>
-          <m:t>l</m:t>
-        </m:r>
-        <m:r>
-          <m:t>e</m:t>
-        </m:r>
-        <m:r>
-          <m:t>g</m:t>
-        </m:r>
-        <m:r>
-          <m:t>a</m:t>
-        </m:r>
-        <m:r>
-          <m:t>l</m:t>
-        </m:r>
-        <m:r>
-          <m:t>n</m:t>
-        </m:r>
-        <m:r>
-          <m:t>o</m:t>
-        </m:r>
-        <m:r>
-          <m:t>t</m:t>
-        </m:r>
-        <m:r>
-          <m:t>i</m:t>
-        </m:r>
-        <m:r>
-          <m:t>c</m:t>
-        </m:r>
-        <m:r>
-          <m:t>e</m:t>
-        </m:r>
-        <m:r>
-          <m:t>s</m:t>
-        </m:r>
-        <m:r>
-          <m:rPr>
-            <m:sty m:val="p"/>
-          </m:rPr>
-          <m:t>)</m:t>
-        </m:r>
-        <m:r>
-          <m:rPr>
-            <m:sty m:val="p"/>
-          </m:rPr>
-          <m:t>,</m:t>
-        </m:r>
-        <m:r>
-          <m:t>Z</m:t>
-        </m:r>
-        <m:r>
-          <m:t>e</m:t>
-        </m:r>
-        <m:r>
-          <m:t>b</m:t>
-        </m:r>
-        <m:r>
-          <m:t>a</m:t>
-        </m:r>
-        <m:r>
-          <m:t>C</m:t>
-        </m:r>
-        <m:r>
-          <m:t>o</m:t>
-        </m:r>
-        <m:r>
-          <m:t>n</m:t>
-        </m:r>
-        <m:r>
-          <m:t>s</m:t>
-        </m:r>
-        <m:r>
-          <m:t>u</m:t>
-        </m:r>
-        <m:r>
-          <m:t>l</m:t>
-        </m:r>
-        <m:r>
-          <m:t>t</m:t>
-        </m:r>
-        <m:r>
-          <m:t>i</m:t>
-        </m:r>
-        <m:r>
-          <m:t>n</m:t>
-        </m:r>
-        <m:r>
-          <m:t>g</m:t>
-        </m:r>
-        <m:r>
-          <m:rPr>
-            <m:sty m:val="p"/>
-          </m:rPr>
-          <m:t>(</m:t>
-        </m:r>
-      </m:oMath>
-      <w:r>
-        <w:t xml:space="preserve">1.19M full-service agency), Promotion Marketing (</w:t>
-      </w:r>
-      <m:oMath>
-        <m:r>
-          <m:t>340</m:t>
-        </m:r>
-        <m:r>
-          <m:t>K</m:t>
-        </m:r>
-        <m:r>
-          <m:t>a</m:t>
-        </m:r>
-        <m:r>
-          <m:t>g</m:t>
-        </m:r>
-        <m:r>
-          <m:t>e</m:t>
-        </m:r>
-        <m:r>
-          <m:t>n</m:t>
-        </m:r>
-        <m:r>
-          <m:t>c</m:t>
-        </m:r>
-        <m:r>
-          <m:t>y</m:t>
-        </m:r>
-        <m:r>
-          <m:rPr>
-            <m:sty m:val="p"/>
-          </m:rPr>
-          <m:t>)</m:t>
-        </m:r>
-        <m:r>
-          <m:rPr>
-            <m:sty m:val="p"/>
-          </m:rPr>
-          <m:t>,</m:t>
-        </m:r>
-        <m:r>
-          <m:t>a</m:t>
-        </m:r>
-        <m:r>
-          <m:t>n</m:t>
-        </m:r>
-        <m:r>
-          <m:t>d</m:t>
-        </m:r>
-        <m:r>
-          <m:t>I</m:t>
-        </m:r>
-        <m:r>
-          <m:t>n</m:t>
-        </m:r>
-        <m:r>
-          <m:t>t</m:t>
-        </m:r>
-        <m:r>
-          <m:t>e</m:t>
-        </m:r>
-        <m:r>
-          <m:t>r</m:t>
-        </m:r>
-        <m:r>
-          <m:t>s</m:t>
-        </m:r>
-        <m:r>
-          <m:t>e</m:t>
-        </m:r>
-        <m:r>
-          <m:t>c</m:t>
-        </m:r>
-        <m:r>
-          <m:t>t</m:t>
-        </m:r>
-        <m:r>
-          <m:t>i</m:t>
-        </m:r>
-        <m:r>
-          <m:t>o</m:t>
-        </m:r>
-        <m:r>
-          <m:t>n</m:t>
-        </m:r>
-        <m:r>
-          <m:t>M</m:t>
-        </m:r>
-        <m:r>
-          <m:t>e</m:t>
-        </m:r>
-        <m:r>
-          <m:t>d</m:t>
-        </m:r>
-        <m:r>
-          <m:t>i</m:t>
-        </m:r>
-        <m:r>
-          <m:t>a</m:t>
-        </m:r>
-        <m:r>
-          <m:rPr>
-            <m:sty m:val="p"/>
-          </m:rPr>
-          <m:t>(</m:t>
-        </m:r>
-      </m:oMath>
-      <w:r>
-        <w:t xml:space="preserve">312K out-of-home) — exactly the categories DataDiver's three-layer model was designed to surface as non-community spending. OEWD labeled all four as "Other Media," confirming they should not count toward compliance.</w:t>
+        <w:t xml:space="preserve">In the 2017–2022 period, the top four advertising recipients were Daily Journal Corporation ($1.73M legal notices), Zeba Consulting ($1.19M full-service agency), Promotion Marketing ($340K agency), and Intersection Media ($312K out-of-home) — exactly the categories DataDiver's three-layer model was designed to surface as non-community spending. OEWD labeled all four as "Other Media," confirming they should not count toward compliance.</w:t>
       </w:r>
     </w:p>
     <w:p>
@@ -3160,123 +2708,7 @@
         <w:t xml:space="preserve"> </w:t>
       </w:r>
       <w:r>
-        <w:t xml:space="preserve">Mandatory legal publications hit a record $504,612 in FY2026 — 37% of all tagged advertising, up from</w:t>
-      </w:r>
-      <w:r>
-        <w:t xml:space="preserve"> </w:t>
-      </w:r>
-      <m:oMath>
-        <m:r>
-          <m:t>371</m:t>
-        </m:r>
-        <m:r>
-          <m:rPr>
-            <m:sty m:val="p"/>
-          </m:rPr>
-          <m:t>,</m:t>
-        </m:r>
-        <m:r>
-          <m:t>290</m:t>
-        </m:r>
-        <m:r>
-          <m:t>i</m:t>
-        </m:r>
-        <m:r>
-          <m:t>n</m:t>
-        </m:r>
-        <m:r>
-          <m:t>F</m:t>
-        </m:r>
-        <m:r>
-          <m:t>Y</m:t>
-        </m:r>
-        <m:r>
-          <m:t>2025</m:t>
-        </m:r>
-        <m:r>
-          <m:rPr>
-            <m:sty m:val="p"/>
-          </m:rPr>
-          <m:t>—</m:t>
-        </m:r>
-        <m:r>
-          <m:t>l</m:t>
-        </m:r>
-        <m:r>
-          <m:t>e</m:t>
-        </m:r>
-        <m:r>
-          <m:t>d</m:t>
-        </m:r>
-        <m:r>
-          <m:t>b</m:t>
-        </m:r>
-        <m:r>
-          <m:t>y</m:t>
-        </m:r>
-        <m:r>
-          <m:t>B</m:t>
-        </m:r>
-        <m:r>
-          <m:t>o</m:t>
-        </m:r>
-        <m:r>
-          <m:t>a</m:t>
-        </m:r>
-        <m:r>
-          <m:t>r</m:t>
-        </m:r>
-        <m:r>
-          <m:t>d</m:t>
-        </m:r>
-        <m:r>
-          <m:t>o</m:t>
-        </m:r>
-        <m:r>
-          <m:t>f</m:t>
-        </m:r>
-        <m:r>
-          <m:t>S</m:t>
-        </m:r>
-        <m:r>
-          <m:t>u</m:t>
-        </m:r>
-        <m:r>
-          <m:t>p</m:t>
-        </m:r>
-        <m:r>
-          <m:t>e</m:t>
-        </m:r>
-        <m:r>
-          <m:t>r</m:t>
-        </m:r>
-        <m:r>
-          <m:t>v</m:t>
-        </m:r>
-        <m:r>
-          <m:t>i</m:t>
-        </m:r>
-        <m:r>
-          <m:t>s</m:t>
-        </m:r>
-        <m:r>
-          <m:t>o</m:t>
-        </m:r>
-        <m:r>
-          <m:t>r</m:t>
-        </m:r>
-        <m:r>
-          <m:t>s</m:t>
-        </m:r>
-        <m:r>
-          <m:rPr>
-            <m:sty m:val="p"/>
-          </m:rPr>
-          <m:t>(</m:t>
-        </m:r>
-      </m:oMath>
-      <w:r>
-        <w:t xml:space="preserve">218,948) and City Planning ($128,982) notice publications through Daily Journal Corporation. Discretionary spending, the budget departments actually control, shrank 17% to $863,441. The rising compliance percentage partly reflects a shrinking denominator.</w:t>
+        <w:t xml:space="preserve">Mandatory legal publications hit a record $504,612 in FY2026 — 37% of all tagged advertising, up from $371,290 in FY2025 — led by Board of Supervisors ($218,948) and City Planning ($128,982) notice publications through Daily Journal Corporation. Discretionary spending, the budget departments actually control, shrank 17% to $863,441. The rising compliance percentage partly reflects a shrinking denominator.</w:t>
       </w:r>
     </w:p>
     <w:p>
@@ -7043,27 +6475,7 @@
         <w:t xml:space="preserve"> </w:t>
       </w:r>
       <w:r>
-        <w:t xml:space="preserve">The Municipal Transportation Agency spends 57–69% of its discretionary advertising with ethnic media, placing ads across 6–8 different community outlets including Sing Tao, World Journal, Bay Area Reporter, El Reportero, SF Neighborhood Newspaper Association, and others. In FY2026 it reached 69.2% — its strongest year in the measurement window — across 8 outlets. MTA demonstrates that meeting the 50% target is operationally achievable at scale — this is a department with a</w:t>
-      </w:r>
-      <w:r>
-        <w:t xml:space="preserve"> </w:t>
-      </w:r>
-      <m:oMath>
-        <m:r>
-          <m:t>53</m:t>
-        </m:r>
-        <m:r>
-          <m:t>K</m:t>
-        </m:r>
-        <m:r>
-          <m:rPr>
-            <m:sty m:val="p"/>
-          </m:rPr>
-          <m:t>–</m:t>
-        </m:r>
-      </m:oMath>
-      <w:r>
-        <w:t xml:space="preserve">59K annual advertising budget, not a token effort. Other departments looking for a template should look at MTA's media buying practices.</w:t>
+        <w:t xml:space="preserve">The Municipal Transportation Agency spends 57–69% of its discretionary advertising with ethnic media, placing ads across 6–8 different community outlets including Sing Tao, World Journal, Bay Area Reporter, El Reportero, SF Neighborhood Newspaper Association, and others. In FY2026 it reached 69.2% — its strongest year in the measurement window — across 8 outlets. MTA demonstrates that meeting the 50% target is operationally achievable at scale — this is a department with a $53K–$59K annual advertising budget, not a token effort. Other departments looking for a template should look at MTA's media buying practices.</w:t>
       </w:r>
     </w:p>
     <w:p>
@@ -7099,21 +6511,7 @@
         <w:t xml:space="preserve"> </w:t>
       </w:r>
       <w:r>
-        <w:t xml:space="preserve">The Assessor-Recorder, Economic &amp; Workforce Development, and the Board of Supervisors each directed 100% of their (modest) advertising to ethnic media in FY2026. These are small dollar amounts (</w:t>
-      </w:r>
-      <m:oMath>
-        <m:r>
-          <m:t>385</m:t>
-        </m:r>
-        <m:r>
-          <m:rPr>
-            <m:sty m:val="p"/>
-          </m:rPr>
-          <m:t>–</m:t>
-        </m:r>
-      </m:oMath>
-      <w:r>
-        <w:t xml:space="preserve">2,000), but they show that compliance isn't a function of budget size — it's a function of choice.</w:t>
+        <w:t xml:space="preserve">The Assessor-Recorder, Economic &amp; Workforce Development, and the Board of Supervisors each directed 100% of their (modest) advertising to ethnic media in FY2026. These are small dollar amounts ($385–$2,000), but they show that compliance isn't a function of budget size — it's a function of choice.</w:t>
       </w:r>
     </w:p>
     <w:bookmarkEnd w:id="33"/>
@@ -7273,303 +6671,17 @@
         <w:pStyle w:val="BodyText"/>
       </w:pPr>
       <w:r>
-        <w:t xml:space="preserve">**Sheriff (</w:t>
-      </w:r>
-      <m:oMath>
-        <m:r>
-          <m:t>121</m:t>
-        </m:r>
-        <m:r>
-          <m:rPr>
-            <m:sty m:val="p"/>
-          </m:rPr>
-          <m:t>,</m:t>
-        </m:r>
-        <m:r>
-          <m:t>118</m:t>
-        </m:r>
-        <m:r>
-          <m:t>d</m:t>
-        </m:r>
-        <m:r>
-          <m:t>i</m:t>
-        </m:r>
-        <m:r>
-          <m:t>s</m:t>
-        </m:r>
-        <m:r>
-          <m:t>c</m:t>
-        </m:r>
-        <m:r>
-          <m:t>r</m:t>
-        </m:r>
-        <m:r>
-          <m:t>e</m:t>
-        </m:r>
-        <m:r>
-          <m:t>t</m:t>
-        </m:r>
-        <m:r>
-          <m:t>i</m:t>
-        </m:r>
-        <m:r>
-          <m:t>o</m:t>
-        </m:r>
-        <m:r>
-          <m:t>n</m:t>
-        </m:r>
-        <m:r>
-          <m:t>a</m:t>
-        </m:r>
-        <m:r>
-          <m:t>r</m:t>
-        </m:r>
-        <m:r>
-          <m:t>y</m:t>
-        </m:r>
-        <m:r>
-          <m:t>i</m:t>
-        </m:r>
-        <m:r>
-          <m:t>n</m:t>
-        </m:r>
-        <m:r>
-          <m:t>F</m:t>
-        </m:r>
-        <m:r>
-          <m:t>Y</m:t>
-        </m:r>
-        <m:r>
-          <m:t>2026</m:t>
-        </m:r>
-        <m:r>
-          <m:rPr>
-            <m:sty m:val="p"/>
-          </m:rPr>
-          <m:t>,</m:t>
-        </m:r>
-        <m:r>
-          <m:t>0</m:t>
-        </m:r>
-      </m:oMath>
-      <w:r>
-        <w:t xml:space="preserve">24,500), KRON TV (</w:t>
-      </w:r>
-      <m:oMath>
-        <m:r>
-          <m:t>20</m:t>
-        </m:r>
-        <m:r>
-          <m:rPr>
-            <m:sty m:val="p"/>
-          </m:rPr>
-          <m:t>,</m:t>
-        </m:r>
-        <m:r>
-          <m:t>000</m:t>
-        </m:r>
-        <m:r>
-          <m:rPr>
-            <m:sty m:val="p"/>
-          </m:rPr>
-          <m:t>)</m:t>
-        </m:r>
-        <m:r>
-          <m:rPr>
-            <m:sty m:val="p"/>
-          </m:rPr>
-          <m:t>,</m:t>
-        </m:r>
-        <m:r>
-          <m:t>C</m:t>
-        </m:r>
-        <m:r>
-          <m:t>o</m:t>
-        </m:r>
-        <m:r>
-          <m:t>l</m:t>
-        </m:r>
-        <m:r>
-          <m:t>e</m:t>
-        </m:r>
-        <m:r>
-          <m:t>P</m:t>
-        </m:r>
-        <m:r>
-          <m:t>r</m:t>
-        </m:r>
-        <m:r>
-          <m:t>o</m:t>
-        </m:r>
-        <m:r>
-          <m:t>M</m:t>
-        </m:r>
-        <m:r>
-          <m:t>e</m:t>
-        </m:r>
-        <m:r>
-          <m:t>d</m:t>
-        </m:r>
-        <m:r>
-          <m:t>i</m:t>
-        </m:r>
-        <m:r>
-          <m:t>a</m:t>
-        </m:r>
-        <m:r>
-          <m:rPr>
-            <m:sty m:val="p"/>
-          </m:rPr>
-          <m:t>(</m:t>
-        </m:r>
-      </m:oMath>
-      <w:r>
-        <w:t xml:space="preserve">18,750), "Top of the World Media" (</w:t>
-      </w:r>
-      <m:oMath>
-        <m:r>
-          <m:t>13</m:t>
-        </m:r>
-        <m:r>
-          <m:rPr>
-            <m:sty m:val="p"/>
-          </m:rPr>
-          <m:t>,</m:t>
-        </m:r>
-        <m:r>
-          <m:t>000</m:t>
-        </m:r>
-        <m:r>
-          <m:rPr>
-            <m:sty m:val="p"/>
-          </m:rPr>
-          <m:t>)</m:t>
-        </m:r>
-        <m:r>
-          <m:rPr>
-            <m:sty m:val="p"/>
-          </m:rPr>
-          <m:t>,</m:t>
-        </m:r>
-        <m:r>
-          <m:t>F</m:t>
-        </m:r>
-        <m:r>
-          <m:t>l</m:t>
-        </m:r>
-        <m:r>
-          <m:t>i</m:t>
-        </m:r>
-        <m:r>
-          <m:t>p</m:t>
-        </m:r>
-        <m:r>
-          <m:t>b</m:t>
-        </m:r>
-        <m:r>
-          <m:t>i</m:t>
-        </m:r>
-        <m:r>
-          <m:t>r</m:t>
-        </m:r>
-        <m:r>
-          <m:t>d</m:t>
-        </m:r>
-        <m:r>
-          <m:t>F</m:t>
-        </m:r>
-        <m:r>
-          <m:t>i</m:t>
-        </m:r>
-        <m:r>
-          <m:t>l</m:t>
-        </m:r>
-        <m:r>
-          <m:t>m</m:t>
-        </m:r>
-        <m:r>
-          <m:t>s</m:t>
-        </m:r>
-        <m:r>
-          <m:rPr>
-            <m:sty m:val="p"/>
-          </m:rPr>
-          <m:t>(</m:t>
-        </m:r>
-      </m:oMath>
-      <w:r>
-        <w:t xml:space="preserve">10,000), Rivet Campus Media (</w:t>
-      </w:r>
-      <m:oMath>
-        <m:r>
-          <m:t>4</m:t>
-        </m:r>
-        <m:r>
-          <m:rPr>
-            <m:sty m:val="p"/>
-          </m:rPr>
-          <m:t>,</m:t>
-        </m:r>
-        <m:r>
-          <m:t>275</m:t>
-        </m:r>
-        <m:r>
-          <m:rPr>
-            <m:sty m:val="p"/>
-          </m:rPr>
-          <m:t>)</m:t>
-        </m:r>
-        <m:r>
-          <m:rPr>
-            <m:sty m:val="p"/>
-          </m:rPr>
-          <m:t>,</m:t>
-        </m:r>
-        <m:r>
-          <m:t>S</m:t>
-        </m:r>
-        <m:r>
-          <m:t>A</m:t>
-        </m:r>
-        <m:r>
-          <m:t>C</m:t>
-        </m:r>
-        <m:r>
-          <m:t>J</m:t>
-        </m:r>
-        <m:r>
-          <m:t>O</m:t>
-        </m:r>
-        <m:r>
-          <m:t>B</m:t>
-        </m:r>
-        <m:r>
-          <m:t>S</m:t>
-        </m:r>
-        <m:r>
-          <m:rPr>
-            <m:sty m:val="p"/>
-          </m:rPr>
-          <m:t>.</m:t>
-        </m:r>
-        <m:r>
-          <m:t>C</m:t>
-        </m:r>
-        <m:r>
-          <m:t>O</m:t>
-        </m:r>
-        <m:r>
-          <m:t>M</m:t>
-        </m:r>
-        <m:r>
-          <m:rPr>
-            <m:sty m:val="p"/>
-          </m:rPr>
-          <m:t>(</m:t>
-        </m:r>
-      </m:oMath>
-      <w:r>
-        <w:t xml:space="preserve">2,142), and $28,451 across 11 payments recorded only as "Single Payment Payees" — the financial system's aggregation for one-time payees, which obscures the recipients entirely. These appear to be recruitment placements. Not a single dollar went to Chinese-language, Spanish-language, Filipino, African American, or LGBTQ+ press — the communities that make up the majority of San Francisco's population.</w:t>
+        <w:rPr>
+          <w:b/>
+          <w:bCs/>
+        </w:rPr>
+        <w:t xml:space="preserve">Sheriff ($121,118 discretionary in FY2026, 0% ethnic media):</w:t>
+      </w:r>
+      <w:r>
+        <w:t xml:space="preserve"> </w:t>
+      </w:r>
+      <w:r>
+        <w:t xml:space="preserve">The Sheriff's advertising includes Professional Sports Publications ($24,500), KRON TV ($20,000), Cole Pro Media ($18,750), "Top of the World Media" ($13,000), Flipbird Films ($10,000), Rivet Campus Media ($4,275), SACJOBS.COM ($2,142), and $28,451 across 11 payments recorded only as "Single Payment Payees" — the financial system's aggregation for one-time payees, which obscures the recipients entirely. These appear to be recruitment placements. Not a single dollar went to Chinese-language, Spanish-language, Filipino, African American, or LGBTQ+ press — the communities that make up the majority of San Francisco's population.</w:t>
       </w:r>
     </w:p>
     <w:p>
@@ -7577,322 +6689,17 @@
         <w:pStyle w:val="BodyText"/>
       </w:pPr>
       <w:r>
-        <w:t xml:space="preserve">**Human Resources (</w:t>
-      </w:r>
-      <m:oMath>
-        <m:r>
-          <m:t>62</m:t>
-        </m:r>
-        <m:r>
-          <m:rPr>
-            <m:sty m:val="p"/>
-          </m:rPr>
-          <m:t>,</m:t>
-        </m:r>
-        <m:r>
-          <m:t>932</m:t>
-        </m:r>
-        <m:r>
-          <m:t>d</m:t>
-        </m:r>
-        <m:r>
-          <m:t>i</m:t>
-        </m:r>
-        <m:r>
-          <m:t>s</m:t>
-        </m:r>
-        <m:r>
-          <m:t>c</m:t>
-        </m:r>
-        <m:r>
-          <m:t>r</m:t>
-        </m:r>
-        <m:r>
-          <m:t>e</m:t>
-        </m:r>
-        <m:r>
-          <m:t>t</m:t>
-        </m:r>
-        <m:r>
-          <m:t>i</m:t>
-        </m:r>
-        <m:r>
-          <m:t>o</m:t>
-        </m:r>
-        <m:r>
-          <m:t>n</m:t>
-        </m:r>
-        <m:r>
-          <m:t>a</m:t>
-        </m:r>
-        <m:r>
-          <m:t>r</m:t>
-        </m:r>
-        <m:r>
-          <m:t>y</m:t>
-        </m:r>
-        <m:r>
-          <m:t>i</m:t>
-        </m:r>
-        <m:r>
-          <m:t>n</m:t>
-        </m:r>
-        <m:r>
-          <m:t>F</m:t>
-        </m:r>
-        <m:r>
-          <m:t>Y</m:t>
-        </m:r>
-        <m:r>
-          <m:t>2026</m:t>
-        </m:r>
-        <m:r>
-          <m:rPr>
-            <m:sty m:val="p"/>
-          </m:rPr>
-          <m:t>,</m:t>
-        </m:r>
-        <m:r>
-          <m:t>4.7</m:t>
-        </m:r>
-      </m:oMath>
-      <w:r>
-        <w:t xml:space="preserve">39,996) — and on law enforcement trade press (PORAC Law Enforcement News,</w:t>
-      </w:r>
-      <w:r>
-        <w:t xml:space="preserve"> </w:t>
-      </w:r>
-      <m:oMath>
-        <m:r>
-          <m:t>11</m:t>
-        </m:r>
-        <m:r>
-          <m:rPr>
-            <m:sty m:val="p"/>
-          </m:rPr>
-          <m:t>,</m:t>
-        </m:r>
-        <m:r>
-          <m:t>750</m:t>
-        </m:r>
-        <m:r>
-          <m:rPr>
-            <m:sty m:val="p"/>
-          </m:rPr>
-          <m:t>)</m:t>
-        </m:r>
-        <m:r>
-          <m:rPr>
-            <m:sty m:val="p"/>
-          </m:rPr>
-          <m:t>.</m:t>
-        </m:r>
-        <m:r>
-          <m:t>H</m:t>
-        </m:r>
-        <m:r>
-          <m:t>R</m:t>
-        </m:r>
-        <m:r>
-          <m:t>D</m:t>
-        </m:r>
-        <m:r>
-          <m:t>d</m:t>
-        </m:r>
-        <m:r>
-          <m:t>o</m:t>
-        </m:r>
-        <m:r>
-          <m:t>e</m:t>
-        </m:r>
-        <m:r>
-          <m:t>s</m:t>
-        </m:r>
-        <m:r>
-          <m:t>p</m:t>
-        </m:r>
-        <m:r>
-          <m:t>l</m:t>
-        </m:r>
-        <m:r>
-          <m:t>a</m:t>
-        </m:r>
-        <m:r>
-          <m:t>c</m:t>
-        </m:r>
-        <m:r>
-          <m:t>e</m:t>
-        </m:r>
-        <m:r>
-          <m:t>s</m:t>
-        </m:r>
-        <m:r>
-          <m:t>o</m:t>
-        </m:r>
-        <m:r>
-          <m:t>m</m:t>
-        </m:r>
-        <m:r>
-          <m:t>e</m:t>
-        </m:r>
-        <m:r>
-          <m:t>e</m:t>
-        </m:r>
-        <m:r>
-          <m:t>t</m:t>
-        </m:r>
-        <m:r>
-          <m:t>h</m:t>
-        </m:r>
-        <m:r>
-          <m:t>n</m:t>
-        </m:r>
-        <m:r>
-          <m:t>i</m:t>
-        </m:r>
-        <m:r>
-          <m:t>c</m:t>
-        </m:r>
-        <m:r>
-          <m:t>m</m:t>
-        </m:r>
-        <m:r>
-          <m:t>e</m:t>
-        </m:r>
-        <m:r>
-          <m:t>d</m:t>
-        </m:r>
-        <m:r>
-          <m:t>i</m:t>
-        </m:r>
-        <m:r>
-          <m:t>a</m:t>
-        </m:r>
-        <m:r>
-          <m:rPr>
-            <m:sty m:val="p"/>
-          </m:rPr>
-          <m:t>:</m:t>
-        </m:r>
-        <m:r>
-          <m:t>W</m:t>
-        </m:r>
-        <m:r>
-          <m:t>o</m:t>
-        </m:r>
-        <m:r>
-          <m:t>r</m:t>
-        </m:r>
-        <m:r>
-          <m:t>l</m:t>
-        </m:r>
-        <m:r>
-          <m:t>d</m:t>
-        </m:r>
-        <m:r>
-          <m:t>J</m:t>
-        </m:r>
-        <m:r>
-          <m:t>o</m:t>
-        </m:r>
-        <m:r>
-          <m:t>u</m:t>
-        </m:r>
-        <m:r>
-          <m:t>r</m:t>
-        </m:r>
-        <m:r>
-          <m:t>n</m:t>
-        </m:r>
-        <m:r>
-          <m:t>a</m:t>
-        </m:r>
-        <m:r>
-          <m:t>l</m:t>
-        </m:r>
-        <m:r>
-          <m:rPr>
-            <m:sty m:val="p"/>
-          </m:rPr>
-          <m:t>(</m:t>
-        </m:r>
-      </m:oMath>
-      <w:r>
-        <w:t xml:space="preserve">1,380), Sing Tao Daily (</w:t>
-      </w:r>
-      <m:oMath>
-        <m:r>
-          <m:t>960</m:t>
-        </m:r>
-        <m:r>
-          <m:rPr>
-            <m:sty m:val="p"/>
-          </m:rPr>
-          <m:t>)</m:t>
-        </m:r>
-        <m:r>
-          <m:rPr>
-            <m:sty m:val="p"/>
-          </m:rPr>
-          <m:t>,</m:t>
-        </m:r>
-        <m:r>
-          <m:t>a</m:t>
-        </m:r>
-        <m:r>
-          <m:t>n</m:t>
-        </m:r>
-        <m:r>
-          <m:t>d</m:t>
-        </m:r>
-        <m:r>
-          <m:t>W</m:t>
-        </m:r>
-        <m:r>
-          <m:t>i</m:t>
-        </m:r>
-        <m:r>
-          <m:t>n</m:t>
-        </m:r>
-        <m:r>
-          <m:t>d</m:t>
-        </m:r>
-        <m:r>
-          <m:t>N</m:t>
-        </m:r>
-        <m:r>
-          <m:t>e</m:t>
-        </m:r>
-        <m:r>
-          <m:t>w</m:t>
-        </m:r>
-        <m:r>
-          <m:t>s</m:t>
-        </m:r>
-        <m:r>
-          <m:t>p</m:t>
-        </m:r>
-        <m:r>
-          <m:t>a</m:t>
-        </m:r>
-        <m:r>
-          <m:t>p</m:t>
-        </m:r>
-        <m:r>
-          <m:t>e</m:t>
-        </m:r>
-        <m:r>
-          <m:t>r</m:t>
-        </m:r>
-        <m:r>
-          <m:rPr>
-            <m:sty m:val="p"/>
-          </m:rPr>
-          <m:t>(</m:t>
-        </m:r>
-      </m:oMath>
-      <w:r>
-        <w:t xml:space="preserve">590). But the ratio is stark: $11,750 in a single law enforcement trade publication versus $2,930 total across all ethnic press.</w:t>
+        <w:rPr>
+          <w:b/>
+          <w:bCs/>
+        </w:rPr>
+        <w:t xml:space="preserve">Human Resources ($62,932 discretionary in FY2026, 4.7% ethnic media):</w:t>
+      </w:r>
+      <w:r>
+        <w:t xml:space="preserve"> </w:t>
+      </w:r>
+      <w:r>
+        <w:t xml:space="preserve">HRD spends heavily through agencies — Great Kolor LLC ($39,996) — and on law enforcement trade press (PORAC Law Enforcement News, $11,750). HRD does place some ethnic media: World Journal ($1,380), Sing Tao Daily ($960), and Wind Newspaper ($590). But the ratio is stark: $11,750 in a single law enforcement trade publication versus $2,930 total across all ethnic press.</w:t>
       </w:r>
     </w:p>
     <w:p>
@@ -8574,147 +7381,7 @@
         <w:pStyle w:val="BodyText"/>
       </w:pPr>
       <w:r>
-        <w:t xml:space="preserve">A related issue affects agencies whose contracts are tagged as Advertising — most notably Most Likely To's work for the Department of Elections ($424,980 in FY2025 and</w:t>
-      </w:r>
-      <w:r>
-        <w:t xml:space="preserve"> </w:t>
-      </w:r>
-      <m:oMath>
-        <m:r>
-          <m:t>240</m:t>
-        </m:r>
-        <m:r>
-          <m:rPr>
-            <m:sty m:val="p"/>
-          </m:rPr>
-          <m:t>,</m:t>
-        </m:r>
-        <m:r>
-          <m:t>357</m:t>
-        </m:r>
-        <m:r>
-          <m:t>i</m:t>
-        </m:r>
-        <m:r>
-          <m:t>n</m:t>
-        </m:r>
-        <m:r>
-          <m:t>F</m:t>
-        </m:r>
-        <m:r>
-          <m:t>Y</m:t>
-        </m:r>
-        <m:r>
-          <m:t>2026</m:t>
-        </m:r>
-        <m:r>
-          <m:rPr>
-            <m:sty m:val="p"/>
-          </m:rPr>
-          <m:t>)</m:t>
-        </m:r>
-        <m:r>
-          <m:t>a</m:t>
-        </m:r>
-        <m:r>
-          <m:t>n</m:t>
-        </m:r>
-        <m:r>
-          <m:t>d</m:t>
-        </m:r>
-        <m:r>
-          <m:rPr>
-            <m:sty m:val="p"/>
-          </m:rPr>
-          <m:t>,</m:t>
-        </m:r>
-        <m:r>
-          <m:t>n</m:t>
-        </m:r>
-        <m:r>
-          <m:t>e</m:t>
-        </m:r>
-        <m:r>
-          <m:t>w</m:t>
-        </m:r>
-        <m:r>
-          <m:t>i</m:t>
-        </m:r>
-        <m:r>
-          <m:t>n</m:t>
-        </m:r>
-        <m:r>
-          <m:t>F</m:t>
-        </m:r>
-        <m:r>
-          <m:t>Y</m:t>
-        </m:r>
-        <m:r>
-          <m:t>2026</m:t>
-        </m:r>
-        <m:r>
-          <m:rPr>
-            <m:sty m:val="p"/>
-          </m:rPr>
-          <m:t>,</m:t>
-        </m:r>
-        <m:r>
-          <m:t>t</m:t>
-        </m:r>
-        <m:r>
-          <m:t>h</m:t>
-        </m:r>
-        <m:r>
-          <m:t>e</m:t>
-        </m:r>
-        <m:r>
-          <m:t>P</m:t>
-        </m:r>
-        <m:r>
-          <m:t>u</m:t>
-        </m:r>
-        <m:r>
-          <m:t>b</m:t>
-        </m:r>
-        <m:r>
-          <m:t>l</m:t>
-        </m:r>
-        <m:r>
-          <m:t>i</m:t>
-        </m:r>
-        <m:r>
-          <m:t>c</m:t>
-        </m:r>
-        <m:r>
-          <m:t>L</m:t>
-        </m:r>
-        <m:r>
-          <m:t>i</m:t>
-        </m:r>
-        <m:r>
-          <m:t>b</m:t>
-        </m:r>
-        <m:r>
-          <m:t>r</m:t>
-        </m:r>
-        <m:r>
-          <m:t>a</m:t>
-        </m:r>
-        <m:r>
-          <m:t>r</m:t>
-        </m:r>
-        <m:r>
-          <m:t>y</m:t>
-        </m:r>
-        <m:r>
-          <m:rPr>
-            <m:sty m:val="p"/>
-          </m:rPr>
-          <m:t>(</m:t>
-        </m:r>
-      </m:oMath>
-      <w:r>
-        <w:t xml:space="preserve">106,986). Unlike the agencies listed above, this spending is classified as Advertising and counts in the compliance denominator. But the same opacity applies: we cannot see whether the agency placed ads in ethnic media, in mainstream media, or spent the funds on non-placement services. The classification as "Advertising" may overstate the actual media buy, inflating the denominator with strategy and creative costs that are not discretionary ad placements. This affects the accuracy of both the numerator and the denominator.</w:t>
+        <w:t xml:space="preserve">A related issue affects agencies whose contracts are tagged as Advertising — most notably Most Likely To's work for the Department of Elections ($424,980 in FY2025 and $240,357 in FY2026) and, new in FY2026, the Public Library ($106,986). Unlike the agencies listed above, this spending is classified as Advertising and counts in the compliance denominator. But the same opacity applies: we cannot see whether the agency placed ads in ethnic media, in mainstream media, or spent the funds on non-placement services. The classification as "Advertising" may overstate the actual media buy, inflating the denominator with strategy and creative costs that are not discretionary ad placements. This affects the accuracy of both the numerator and the denominator.</w:t>
       </w:r>
     </w:p>
     <w:p>
@@ -9357,33 +8024,7 @@
         <w:pStyle w:val="FirstParagraph"/>
       </w:pPr>
       <w:r>
-        <w:t xml:space="preserve">P-card advertising totaling</w:t>
-      </w:r>
-      <w:r>
-        <w:t xml:space="preserve"> </w:t>
-      </w:r>
-      <m:oMath>
-        <m:r>
-          <m:t>33</m:t>
-        </m:r>
-        <m:r>
-          <m:rPr>
-            <m:sty m:val="p"/>
-          </m:rPr>
-          <m:t>,</m:t>
-        </m:r>
-        <m:r>
-          <m:t>000</m:t>
-        </m:r>
-        <m:r>
-          <m:rPr>
-            <m:sty m:val="p"/>
-          </m:rPr>
-          <m:t>–</m:t>
-        </m:r>
-      </m:oMath>
-      <w:r>
-        <w:t xml:space="preserve">59,000 per year is included in the discretionary advertising denominator but</w:t>
+        <w:t xml:space="preserve">P-card advertising totaling $33,000–$59,000 per year is included in the discretionary advertising denominator but</w:t>
       </w:r>
       <w:r>
         <w:t xml:space="preserve"> </w:t>
@@ -11046,389 +9687,7 @@
         <w:t xml:space="preserve"> </w:t>
       </w:r>
       <w:r>
-        <w:t xml:space="preserve">Departments with significant expenditures — Elections (</w:t>
-      </w:r>
-      <m:oMath>
-        <m:r>
-          <m:t>240</m:t>
-        </m:r>
-        <m:r>
-          <m:rPr>
-            <m:sty m:val="p"/>
-          </m:rPr>
-          <m:t>,</m:t>
-        </m:r>
-        <m:r>
-          <m:t>357</m:t>
-        </m:r>
-        <m:r>
-          <m:t>i</m:t>
-        </m:r>
-        <m:r>
-          <m:t>n</m:t>
-        </m:r>
-        <m:r>
-          <m:t>F</m:t>
-        </m:r>
-        <m:r>
-          <m:t>Y</m:t>
-        </m:r>
-        <m:r>
-          <m:t>2026</m:t>
-        </m:r>
-        <m:r>
-          <m:rPr>
-            <m:sty m:val="p"/>
-          </m:rPr>
-          <m:t>,</m:t>
-        </m:r>
-        <m:r>
-          <m:t>e</m:t>
-        </m:r>
-        <m:r>
-          <m:t>n</m:t>
-        </m:r>
-        <m:r>
-          <m:t>t</m:t>
-        </m:r>
-        <m:r>
-          <m:t>i</m:t>
-        </m:r>
-        <m:r>
-          <m:t>r</m:t>
-        </m:r>
-        <m:r>
-          <m:t>e</m:t>
-        </m:r>
-        <m:r>
-          <m:t>l</m:t>
-        </m:r>
-        <m:r>
-          <m:t>y</m:t>
-        </m:r>
-        <m:r>
-          <m:t>t</m:t>
-        </m:r>
-        <m:r>
-          <m:t>h</m:t>
-        </m:r>
-        <m:r>
-          <m:t>r</m:t>
-        </m:r>
-        <m:r>
-          <m:t>o</m:t>
-        </m:r>
-        <m:r>
-          <m:t>u</m:t>
-        </m:r>
-        <m:r>
-          <m:t>g</m:t>
-        </m:r>
-        <m:r>
-          <m:t>h</m:t>
-        </m:r>
-        <m:r>
-          <m:t>a</m:t>
-        </m:r>
-        <m:r>
-          <m:t>s</m:t>
-        </m:r>
-        <m:r>
-          <m:t>i</m:t>
-        </m:r>
-        <m:r>
-          <m:t>n</m:t>
-        </m:r>
-        <m:r>
-          <m:t>g</m:t>
-        </m:r>
-        <m:r>
-          <m:t>l</m:t>
-        </m:r>
-        <m:r>
-          <m:t>e</m:t>
-        </m:r>
-        <m:r>
-          <m:t>a</m:t>
-        </m:r>
-        <m:r>
-          <m:t>g</m:t>
-        </m:r>
-        <m:r>
-          <m:t>e</m:t>
-        </m:r>
-        <m:r>
-          <m:t>n</m:t>
-        </m:r>
-        <m:r>
-          <m:t>c</m:t>
-        </m:r>
-        <m:r>
-          <m:t>y</m:t>
-        </m:r>
-        <m:r>
-          <m:rPr>
-            <m:sty m:val="p"/>
-          </m:rPr>
-          <m:t>)</m:t>
-        </m:r>
-        <m:r>
-          <m:rPr>
-            <m:sty m:val="p"/>
-          </m:rPr>
-          <m:t>,</m:t>
-        </m:r>
-        <m:r>
-          <m:t>t</m:t>
-        </m:r>
-        <m:r>
-          <m:t>h</m:t>
-        </m:r>
-        <m:r>
-          <m:t>e</m:t>
-        </m:r>
-        <m:r>
-          <m:t>P</m:t>
-        </m:r>
-        <m:r>
-          <m:t>u</m:t>
-        </m:r>
-        <m:r>
-          <m:t>b</m:t>
-        </m:r>
-        <m:r>
-          <m:t>l</m:t>
-        </m:r>
-        <m:r>
-          <m:t>i</m:t>
-        </m:r>
-        <m:r>
-          <m:t>c</m:t>
-        </m:r>
-        <m:r>
-          <m:t>L</m:t>
-        </m:r>
-        <m:r>
-          <m:t>i</m:t>
-        </m:r>
-        <m:r>
-          <m:t>b</m:t>
-        </m:r>
-        <m:r>
-          <m:t>r</m:t>
-        </m:r>
-        <m:r>
-          <m:t>a</m:t>
-        </m:r>
-        <m:r>
-          <m:t>r</m:t>
-        </m:r>
-        <m:r>
-          <m:t>y</m:t>
-        </m:r>
-        <m:r>
-          <m:rPr>
-            <m:sty m:val="p"/>
-          </m:rPr>
-          <m:t>(</m:t>
-        </m:r>
-      </m:oMath>
-      <w:r>
-        <w:t xml:space="preserve">138,431, mostly agency-routed), Sheriff (</w:t>
-      </w:r>
-      <m:oMath>
-        <m:r>
-          <m:t>121</m:t>
-        </m:r>
-        <m:r>
-          <m:rPr>
-            <m:sty m:val="p"/>
-          </m:rPr>
-          <m:t>,</m:t>
-        </m:r>
-        <m:r>
-          <m:t>118</m:t>
-        </m:r>
-        <m:r>
-          <m:rPr>
-            <m:sty m:val="p"/>
-          </m:rPr>
-          <m:t>,</m:t>
-        </m:r>
-        <m:r>
-          <m:t>p</m:t>
-        </m:r>
-        <m:r>
-          <m:t>r</m:t>
-        </m:r>
-        <m:r>
-          <m:t>i</m:t>
-        </m:r>
-        <m:r>
-          <m:t>m</m:t>
-        </m:r>
-        <m:r>
-          <m:t>a</m:t>
-        </m:r>
-        <m:r>
-          <m:t>r</m:t>
-        </m:r>
-        <m:r>
-          <m:t>i</m:t>
-        </m:r>
-        <m:r>
-          <m:t>l</m:t>
-        </m:r>
-        <m:r>
-          <m:t>y</m:t>
-        </m:r>
-        <m:r>
-          <m:t>r</m:t>
-        </m:r>
-        <m:r>
-          <m:t>e</m:t>
-        </m:r>
-        <m:r>
-          <m:t>c</m:t>
-        </m:r>
-        <m:r>
-          <m:t>r</m:t>
-        </m:r>
-        <m:r>
-          <m:t>u</m:t>
-        </m:r>
-        <m:r>
-          <m:t>i</m:t>
-        </m:r>
-        <m:r>
-          <m:t>t</m:t>
-        </m:r>
-        <m:r>
-          <m:t>m</m:t>
-        </m:r>
-        <m:r>
-          <m:t>e</m:t>
-        </m:r>
-        <m:r>
-          <m:t>n</m:t>
-        </m:r>
-        <m:r>
-          <m:t>t</m:t>
-        </m:r>
-        <m:r>
-          <m:rPr>
-            <m:sty m:val="p"/>
-          </m:rPr>
-          <m:t>)</m:t>
-        </m:r>
-        <m:r>
-          <m:rPr>
-            <m:sty m:val="p"/>
-          </m:rPr>
-          <m:t>,</m:t>
-        </m:r>
-        <m:r>
-          <m:t>a</m:t>
-        </m:r>
-        <m:r>
-          <m:t>n</m:t>
-        </m:r>
-        <m:r>
-          <m:t>d</m:t>
-        </m:r>
-        <m:r>
-          <m:t>t</m:t>
-        </m:r>
-        <m:r>
-          <m:t>h</m:t>
-        </m:r>
-        <m:r>
-          <m:t>e</m:t>
-        </m:r>
-        <m:r>
-          <m:t>P</m:t>
-        </m:r>
-        <m:r>
-          <m:t>u</m:t>
-        </m:r>
-        <m:r>
-          <m:t>b</m:t>
-        </m:r>
-        <m:r>
-          <m:t>l</m:t>
-        </m:r>
-        <m:r>
-          <m:t>i</m:t>
-        </m:r>
-        <m:r>
-          <m:t>c</m:t>
-        </m:r>
-        <m:r>
-          <m:t>U</m:t>
-        </m:r>
-        <m:r>
-          <m:t>t</m:t>
-        </m:r>
-        <m:r>
-          <m:t>i</m:t>
-        </m:r>
-        <m:r>
-          <m:t>l</m:t>
-        </m:r>
-        <m:r>
-          <m:t>i</m:t>
-        </m:r>
-        <m:r>
-          <m:t>t</m:t>
-        </m:r>
-        <m:r>
-          <m:t>i</m:t>
-        </m:r>
-        <m:r>
-          <m:t>e</m:t>
-        </m:r>
-        <m:r>
-          <m:t>s</m:t>
-        </m:r>
-        <m:r>
-          <m:t>C</m:t>
-        </m:r>
-        <m:r>
-          <m:t>o</m:t>
-        </m:r>
-        <m:r>
-          <m:t>m</m:t>
-        </m:r>
-        <m:r>
-          <m:t>m</m:t>
-        </m:r>
-        <m:r>
-          <m:t>i</m:t>
-        </m:r>
-        <m:r>
-          <m:t>s</m:t>
-        </m:r>
-        <m:r>
-          <m:t>s</m:t>
-        </m:r>
-        <m:r>
-          <m:t>i</m:t>
-        </m:r>
-        <m:r>
-          <m:t>o</m:t>
-        </m:r>
-        <m:r>
-          <m:t>n</m:t>
-        </m:r>
-        <m:r>
-          <m:rPr>
-            <m:sty m:val="p"/>
-          </m:rPr>
-          <m:t>(</m:t>
-        </m:r>
-      </m:oMath>
-      <w:r>
-        <w:t xml:space="preserve">110,265, zero ethnic placements) — each represent significant opportunities to improve the citywide number. Department-specific improvement plans, with interim milestones, would create accountability without requiring new legislation. For departments whose spending flows primarily through agencies, compliance targets should include requirements that agencies report outlet-level placements and incorporate ethnic media into their media plans.</w:t>
+        <w:t xml:space="preserve">Departments with significant expenditures — Elections ($240,357 in FY2026, entirely through a single agency), the Public Library ($138,431, mostly agency-routed), Sheriff ($121,118, primarily recruitment), and the Public Utilities Commission ($110,265, zero ethnic placements) — each represent significant opportunities to improve the citywide number. Department-specific improvement plans, with interim milestones, would create accountability without requiring new legislation. For departments whose spending flows primarily through agencies, compliance targets should include requirements that agencies report outlet-level placements and incorporate ethnic media into their media plans.</w:t>
       </w:r>
     </w:p>
     <w:p>
@@ -11919,33 +10178,7 @@
         <w:t xml:space="preserve">P-card opacity</w:t>
       </w:r>
       <w:r>
-        <w:t xml:space="preserve">: The</w:t>
-      </w:r>
-      <w:r>
-        <w:t xml:space="preserve"> </w:t>
-      </w:r>
-      <m:oMath>
-        <m:r>
-          <m:t>33</m:t>
-        </m:r>
-        <m:r>
-          <m:rPr>
-            <m:sty m:val="p"/>
-          </m:rPr>
-          <m:t>,</m:t>
-        </m:r>
-        <m:r>
-          <m:t>000</m:t>
-        </m:r>
-        <m:r>
-          <m:rPr>
-            <m:sty m:val="p"/>
-          </m:rPr>
-          <m:t>–</m:t>
-        </m:r>
-      </m:oMath>
-      <w:r>
-        <w:t xml:space="preserve">59,000/year in P-card advertising cannot be attributed to any media outlet. Department input on what these purchases represent would close this gap (see Section 7).</w:t>
+        <w:t xml:space="preserve">: The $33,000–$59,000/year in P-card advertising cannot be attributed to any media outlet. Department input on what these purchases represent would close this gap (see Section 7).</w:t>
       </w:r>
     </w:p>
     <w:p>

</xml_diff>